<commit_message>
Add guest-list home rubric, guest-list copy buttons, and equipment paste
- Home daily-show checklist now shows a styled guest-list rubric with count
- Copy button on the guest list in both the home card and show-detail Logistics,
  copying the whole list to the clipboard without manual selection
- Equipment checklist accepts pasting a multi-line list to create many items
  at once, alongside single-item add
- Repo cleanup: reorganize design handoffs, remove committed zip archives

Co-Authored-By: Claude Opus 4.7 <noreply@anthropic.com>
</commit_message>
<xml_diff>
--- a/docs/רעיונות להמשך.docx
+++ b/docs/רעיונות להמשך.docx
@@ -181,6 +181,31 @@
           <w:rtl/>
         </w:rPr>
         <w:t>) בלוח משימות</w:t>
+      </w:r>
+    </w:p>
+    <w:p>
+      <w:pPr>
+        <w:pStyle w:val="ListParagraph"/>
+        <w:numPr>
+          <w:ilvl w:val="0"/>
+          <w:numId w:val="1"/>
+        </w:numPr>
+        <w:bidi/>
+      </w:pPr>
+      <w:r>
+        <w:rPr>
+          <w:rFonts w:hint="cs"/>
+          <w:rtl/>
+        </w:rPr>
+        <w:t xml:space="preserve">להוסיף ב </w:t>
+      </w:r>
+      <w:proofErr w:type="spellStart"/>
+      <w:r>
+        <w:t>showform</w:t>
+      </w:r>
+      <w:proofErr w:type="spellEnd"/>
+      <w:r>
+        <w:t xml:space="preserve"> today tomorrow</w:t>
       </w:r>
     </w:p>
     <w:sectPr>

</xml_diff>